<commit_message>
Add adaptive hybrid experiments and interactive 3D study
</commit_message>
<xml_diff>
--- a/manuales/Descripcion_del_Software_SLAMCart3D.docx
+++ b/manuales/Descripcion_del_Software_SLAMCart3D.docx
@@ -362,7 +362,7 @@
     </w:p>
     <w:p>
       <w:r>
-        <w:t>SLAMCart3D es una aplicación científica local para Windows y un paquete Python que simula observaciones de un robot terrestre, ejecuta baselines de estimación y mide su degradación frente a condiciones experimentales controladas. Su pregunta de investigación es cómo localizar de manera eficiente la frontera entre operación aceptable y fallo. La contribución metodológica propia es Adaptive SLAM Robustness Frontier, ASRF.</w:t>
+        <w:t>SLAMCart3D es una aplicación científica local para Windows y un paquete Python que simula observaciones de un robot terrestre, ejecuta baselines y un híbrido adaptativo y mide su degradación frente a condiciones experimentales controladas. Su pregunta de investigación es cómo localizar de manera eficiente la frontera entre operación aceptable y fallo. El proyecto propone un estimador híbrido local y Adaptive SLAM Robustness Frontier (ASRF), un método de selección de condiciones experimentales. Sus contribuciones se evalúan por separado.</w:t>
       </w:r>
     </w:p>
     <w:tbl>
@@ -1095,7 +1095,7 @@
                 <w:rFonts w:ascii="Arial" w:hAnsi="Arial"/>
                 <w:sz w:val="18"/>
               </w:rPr>
-              <w:t>Seis escenarios 2.5D sembrados y robot diferencial con perfiles de movimiento.</w:t>
+              <w:t>Seis escenarios 2.5D y un entorno editable; robot diferencial y parada ante muros estáticos.</w:t>
             </w:r>
           </w:p>
         </w:tc>
@@ -1285,7 +1285,7 @@
                 <w:rFonts w:ascii="Arial" w:hAnsi="Arial"/>
                 <w:sz w:val="18"/>
               </w:rPr>
-              <w:t>Odometría de ruedas, fusión ruedas/IMU y odometría LiDAR con ICP.</w:t>
+              <w:t>Ruedas, ruedas/IMU, ICP y SLAM híbrido adaptativo local.</w:t>
             </w:r>
           </w:p>
         </w:tc>
@@ -1411,7 +1411,7 @@
                 <w:rFonts w:ascii="Arial" w:hAnsi="Arial"/>
                 <w:sz w:val="18"/>
               </w:rPr>
-              <w:t>Lotes multi-seed, ASRF, Grid, Random, Latin Hypercube y ablaciones.</w:t>
+              <w:t>Lotes por semilla, barridos controlados, comparaciones SLAM, ASRF y ablaciones.</w:t>
             </w:r>
           </w:p>
         </w:tc>
@@ -1490,7 +1490,7 @@
     </w:p>
     <w:p>
       <w:r>
-        <w:t>El núcleo headless separa configuración, mundos, cinemática, sensores, degradación, estimadores, métricas y exportación. Una interfaz común permite integrar un nuevo algoritmo sin reemplazar el flujo experimental. La GUI Qt es una capa adicional: las simulaciones en lote y ASRF siguen disponibles sin pantalla. Los componentes de visualización se ejecutan después de la simulación, de modo que pedir una figura no cambia los timestamps ni las medidas.</w:t>
+        <w:t>El núcleo headless separa configuración, mundos, cinemática, sensores, degradación, estimadores, métricas y exportación. Una interfaz común permite integrar un nuevo algoritmo sin reemplazar el flujo experimental. La GUI Qt es una capa adicional: las simulaciones en lote y ASRF siguen disponibles sin pantalla. Los componentes de visualización reciben los pasos de la corrida o su resultado final; pedir una figura no cambia el reloj simulado ni las medidas.</w:t>
       </w:r>
     </w:p>
     <w:p>
@@ -1584,7 +1584,7 @@
     </w:p>
     <w:p>
       <w:r>
-        <w:t>La interfaz ofrece pestañas para preparar experimentos, ver trayectorias, métricas, lotes, frontera ASRF, nube 3D, datasets y ocupación. Cambia entre español e inglés sin perder los valores configurados. Los procesos se ejecutan en hilos de trabajo para mantener la ventana disponible; los controles de inicio se deshabilitan durante una tarea.</w:t>
+        <w:t>La interfaz ofrece pestañas para preparar experimentos, ver trayectorias, métricas, lotes, estudios controlados, frontera ASRF, nube 3D, datasets y ocupación. La escena distingue piso, paredes, carrito y nube estimada; permite recuperar cada paso y ocultar la referencia verdadera. El guardado incremental conserva lo ya calculado. Cambia entre español e inglés sin perder los valores configurados. Los procesos se ejecutan en hilos de trabajo para mantener la ventana disponible; los controles de inicio se deshabilitan durante una tarea.</w:t>
       </w:r>
     </w:p>
     <w:p>
@@ -1610,7 +1610,7 @@
     </w:p>
     <w:p>
       <w:r>
-        <w:t>El objetivo principal de la GUI compilada es Windows. Se generó una carpeta de aplicación mediante PyInstaller onedir; el ZIP candidato extraído superó --self-test en el equipo de desarrollo. La ruta interna más larga del bundle mide 89 caracteres y su tamaño sin comprimir es aproximadamente 149.5 MB. Todavía falta una instalación y ejecución completa en una máquina Windows limpia. La API y CLI requieren Python 3.10 o posterior y las dependencias declaradas en pyproject.toml.</w:t>
+        <w:t>El objetivo principal de la GUI compilada es Windows. Se generó una carpeta de aplicación mediante PyInstaller onedir; el ZIP candidato extraído superó --self-test en el equipo de desarrollo. Las rutas internas del paquete se verifican antes de distribuirlo. Todavía falta una instalación y ejecución completa en una máquina Windows limpia. La API y CLI requieren Python 3.10 o posterior y las dependencias declaradas en pyproject.toml.</w:t>
       </w:r>
     </w:p>
     <w:p>
@@ -1623,12 +1623,12 @@
     </w:p>
     <w:p>
       <w:r>
-        <w:t>Pasaron 178 pruebas automatizadas tanto en el árbol de desarrollo como en el código extraído del ZIP candidato. Los 18 ejemplos YAML se ejecutaron con salidas centrales finitas y cero contactos de centrolinea con paredes estáticas muestreadas. La corrida EXP-0A04E1799939 generó 6 550 puntos 3D, ATE RMSE de 0.000118 m y F1 de paredes 3D de 0.6192; su configuración, semilla, huella y figuras están conservadas en la subcarpeta de resultados. Estos números no son un benchmark de hardware ni un promedio multi-escenario.</w:t>
+        <w:t>Las pruebas automatizadas cubren núcleo científico, algoritmos, exportación e interfaz. La corrida EXP-71EEDD205D56 generó 6 550 puntos 3D, ATE RMSE de 0.000118 m y F1 de paredes 3D de 0.6192; su configuración, semilla, huella y figuras están conservadas en la subcarpeta de resultados. Estos números no son un benchmark de hardware ni un promedio multi-escenario.</w:t>
       </w:r>
     </w:p>
     <w:p>
       <w:r>
-        <w:t>El paquete del ejecutable contiene la misma huella de código que la fuente evaluada. La carpeta congelada y su ZIP fueron probados con --self-test en el equipo Windows de desarrollo. La GUI se probó también en modo Qt offscreen para carga de YAML, ejecución simple, lote, ASRF, dataset, cambio de idioma, nube 3D y ocupación 2D. Una revisión visible con interacción humana y una máquina limpia siguen pendientes.</w:t>
+        <w:t>El paquete del ejecutable contiene la misma huella de código que la fuente evaluada. La carpeta congelada y su ZIP fueron probados con --self-test en el equipo Windows de desarrollo. La GUI se probó también en modo Qt offscreen para carga de YAML, ejecución simple, lote, ASRF, estudio controlado, dataset, cambio de idioma, nube 3D, barra temporal, referencia visual y ocupación 2D. Una revisión visible con interacción humana y una máquina limpia siguen pendientes.</w:t>
       </w:r>
     </w:p>
     <w:p>
@@ -1651,12 +1651,17 @@
     </w:p>
     <w:p>
       <w:r>
-        <w:t>La aportación metodológica verificable es la integración de un muestreador adaptativo de frontera con simulaciones repetibles, métricas objetivas, baselines de diseño y comparaciones de semilla independiente. El software permite aceptar o refutar una hipótesis de eficiencia de muestreo según escenario y presupuesto. No equivale a implementar SLAM de cierre de bucles ni a obtener un resultado definitivo sobre todos los algoritmos.</w:t>
+        <w:t>El estudio HYBRID-6C1041E65534 compara tres referencias, el híbrido y tres ablaciones en 140 corridas con semillas pareadas. El híbrido reduce ATE frente a ICP con LiDAR degradado (0.02589 frente a 0.11506 m) y frente a rueda/IMU con sesgo inercial (0.01810 frente a 0.14125 m). Sin embargo, con sensores moderados rueda/IMU obtiene 0.00079 m frente a 0.01956 m del híbrido, y con ruido de ruedas tampoco gana la propuesta. La odometría solo de ruedas es la mejor en el escenario de sesgo IMU. El mapa y el RPE confirman que la mejora depende de la condición y de la métrica evaluada.</w:t>
       </w:r>
     </w:p>
     <w:p>
       <w:r>
-        <w:t>El estado físico actual es 2.5D: no hay pose rígida 6DoF, respuesta a colisiones, odometría visual ni estimación probabilística calibrada de ocupación. Se requieren más escenas, semillas y validación independiente para evaluar la generalidad del método.</w:t>
+        <w:t>La aportación implementada reúne un estimador híbrido con confianza ajustada a partir de residuos medidos y la integración de un muestreador adaptativo de frontera con simulaciones repetibles, métricas objetivas, baselines de diseño y comparaciones de semilla independiente. El software permite aceptar o refutar una hipótesis sobre estimación y eficiencia de muestreo según escenario y presupuesto. No equivale a implementar SLAM de cierre de bucles ni a obtener un resultado definitivo sobre todos los algoritmos.</w:t>
+      </w:r>
+    </w:p>
+    <w:p>
+      <w:r>
+        <w:t>El estado físico actual es 2.5D: no hay pose rígida 6DoF, física completa de colisiones, odometría visual ni estimación probabilística calibrada de ocupación. Se requieren más escenas, semillas y validación independiente para evaluar la generalidad del método.</w:t>
       </w:r>
     </w:p>
     <w:sectPr>

</xml_diff>